<commit_message>
ajuste labs 1 e 2 docx
</commit_message>
<xml_diff>
--- a/Labs/LAB1.docx
+++ b/Labs/LAB1.docx
@@ -134,10 +134,7 @@
         </w:numPr>
       </w:pPr>
       <w:r>
-        <w:t>Identificar oportunidades de uso de IA a partir de dados e</w:t>
-      </w:r>
-      <w:r>
-        <w:t>xistentes.</w:t>
+        <w:t>Identificar oportunidades de uso de IA a partir de dados existentes.</w:t>
       </w:r>
     </w:p>
     <w:p>
@@ -205,10 +202,7 @@
         </w:numPr>
       </w:pPr>
       <w:r>
-        <w:t>Acessar o ECLASS e confi</w:t>
-      </w:r>
-      <w:r>
-        <w:t>rmar a formação.</w:t>
+        <w:t>Acessar o ECLASS e confirmar a formação.</w:t>
       </w:r>
     </w:p>
     <w:p>
@@ -243,10 +237,7 @@
       </w:pPr>
       <w:bookmarkStart w:id="4" w:name="X5e070db65ae34df282f1dbf2819132c94ef7249"/>
       <w:r>
-        <w:t>Atividade 1.1: Cartão-Resposta Histórico</w:t>
-      </w:r>
-      <w:r>
-        <w:t>, 10 min</w:t>
+        <w:t>Atividade 1.1: Cartão-Resposta Histórico, 10 min</w:t>
       </w:r>
     </w:p>
     <w:p>
@@ -302,10 +293,7 @@
               <w:pStyle w:val="Compact"/>
             </w:pPr>
             <w:r>
-              <w:t>Sua Re</w:t>
-            </w:r>
-            <w:r>
-              <w:t>sposta</w:t>
+              <w:t>Sua Resposta</w:t>
             </w:r>
           </w:p>
         </w:tc>
@@ -576,10 +564,7 @@
       <w:bookmarkStart w:id="5" w:name="X1d7fe85ad9f690d448a63724c2da4f0edffd1d0"/>
       <w:bookmarkEnd w:id="4"/>
       <w:r>
-        <w:t>Atividade 1.2: Discussão em Grupo</w:t>
-      </w:r>
-      <w:r>
-        <w:t>, 10 min</w:t>
+        <w:t>Atividade 1.2: Discussão em Grupo, 10 min</w:t>
       </w:r>
     </w:p>
     <w:p>
@@ -644,13 +629,7 @@
       </w:pPr>
       <w:bookmarkStart w:id="7" w:name="X6d7c0a6bc0efbfde4ed4bce1c28435d25c1fb50"/>
       <w:r>
-        <w:t>Atividade 2.1: Classifique os Sistemas</w:t>
-      </w:r>
-      <w:r>
-        <w:t xml:space="preserve">, 10 </w:t>
-      </w:r>
-      <w:r>
-        <w:t>min</w:t>
+        <w:t>Atividade 2.1: Classifique os Sistemas, 10 min</w:t>
       </w:r>
     </w:p>
     <w:p>
@@ -1056,10 +1035,7 @@
         <w:t>3 sistemas transacionais</w:t>
       </w:r>
       <w:r>
-        <w:t xml:space="preserve"> </w:t>
-      </w:r>
-      <w:r>
-        <w:t>que a empresa provavelmente já possui.</w:t>
+        <w:t xml:space="preserve"> que a empresa provavelmente já possui.</w:t>
       </w:r>
     </w:p>
     <w:p>
@@ -1141,10 +1117,7 @@
         <w:pStyle w:val="FirstParagraph"/>
       </w:pPr>
       <w:r>
-        <w:t xml:space="preserve">Para </w:t>
-      </w:r>
-      <w:r>
-        <w:t>cada fonte de dados da LODLog, discuta e preencha o seu perfil nos 5 Vs e como ela se conecta com as necessidades de Ciência de Dados e IA (exemplos de uso prático):</w:t>
+        <w:t>Para cada fonte de dados da LODLog, discuta e preencha o seu perfil nos 5 Vs e como ela se conecta com as necessidades de Ciência de Dados e IA (exemplos de uso prático):</w:t>
       </w:r>
     </w:p>
     <w:tbl>
@@ -1258,10 +1231,7 @@
               <w:pStyle w:val="Compact"/>
             </w:pPr>
             <w:r>
-              <w:t>Con</w:t>
-            </w:r>
-            <w:r>
-              <w:t>exão com CD (ML/IA)</w:t>
+              <w:t>Conexão com CD (ML/IA)</w:t>
             </w:r>
           </w:p>
         </w:tc>
@@ -1598,16 +1568,22 @@
             <w:pPr>
               <w:pStyle w:val="Compact"/>
             </w:pPr>
-          </w:p>
-        </w:tc>
-        <w:tc>
-          <w:tcPr>
-            <w:tcW w:w="0" w:type="auto"/>
-          </w:tcPr>
-          <w:p>
-            <w:pPr>
-              <w:pStyle w:val="Compact"/>
-            </w:pPr>
+            <w:r>
+              <w:t>NA</w:t>
+            </w:r>
+          </w:p>
+        </w:tc>
+        <w:tc>
+          <w:tcPr>
+            <w:tcW w:w="0" w:type="auto"/>
+          </w:tcPr>
+          <w:p>
+            <w:pPr>
+              <w:pStyle w:val="Compact"/>
+            </w:pPr>
+            <w:r>
+              <w:t>NA</w:t>
+            </w:r>
           </w:p>
         </w:tc>
         <w:tc>
@@ -1628,6 +1604,9 @@
             <w:pPr>
               <w:pStyle w:val="Compact"/>
             </w:pPr>
+            <w:r>
+              <w:t>NA</w:t>
+            </w:r>
           </w:p>
         </w:tc>
         <w:tc>
@@ -1649,10 +1628,7 @@
       <w:bookmarkStart w:id="11" w:name="atividade-3.2-priorização-grupo-10-min"/>
       <w:bookmarkEnd w:id="10"/>
       <w:r>
-        <w:t>Atividade 3.2: Priorização</w:t>
-      </w:r>
-      <w:r>
-        <w:t>, 10 min</w:t>
+        <w:t>Atividade 3.2: Priorização, 10 min</w:t>
       </w:r>
     </w:p>
     <w:p>
@@ -1731,10 +1707,7 @@
       </w:pPr>
       <w:bookmarkStart w:id="13" w:name="X6a33732f26be4d3173617b45437326323898017"/>
       <w:r>
-        <w:t>Atividade 4.1: Clas</w:t>
-      </w:r>
-      <w:r>
-        <w:t>sifique os Serviços individual, 10 min</w:t>
+        <w:t>Atividade 4.1: Classifique os Serviços individual, 10 min</w:t>
       </w:r>
     </w:p>
     <w:p>
@@ -2085,10 +2058,7 @@
         <w:t>ORGANIZAR/ARMAZENAR (Processamento, Limpeza e Enriquecimento)</w:t>
       </w:r>
       <w:r>
-        <w:t>: Como faremos o pro</w:t>
-      </w:r>
-      <w:r>
-        <w:t>cessamento e transformação? Qual modelo de serviço (I/P/S) e qual exemplo de serviço? Como isso é mapeado entre as camadas Bronze, Silver e Gold?</w:t>
+        <w:t>: Como faremos o processamento e transformação? Qual modelo de serviço (I/P/S) e qual exemplo de serviço? Como isso é mapeado entre as camadas Bronze, Silver e Gold?</w:t>
       </w:r>
     </w:p>
     <w:p>
@@ -2107,10 +2077,7 @@
         <w:t>DISPONIBILIZAR (Consumo e Integração com IA)</w:t>
       </w:r>
       <w:r>
-        <w:t>: Como os analistas, dashboards e modelos de Machine Learning cons</w:t>
-      </w:r>
-      <w:r>
-        <w:t>umirão os dados? Qual modelo de serviço (I/P/S) e qual exemplo de serviço? A partir de qual camada Medallion?</w:t>
+        <w:t>: Como os analistas, dashboards e modelos de Machine Learning consumirão os dados? Qual modelo de serviço (I/P/S) e qual exemplo de serviço? A partir de qual camada Medallion?</w:t>
       </w:r>
     </w:p>
     <w:p>
@@ -2135,10 +2102,7 @@
         <w:t>um serviço de cada modelo</w:t>
       </w:r>
       <w:r>
-        <w:t xml:space="preserve"> (IaaS, PaaS, SaaS) e explicar como os dados fluem pelas camadas Medallion (Bronz</w:t>
-      </w:r>
-      <w:r>
-        <w:t>e -&gt; Silver -&gt; Gold).</w:t>
+        <w:t xml:space="preserve"> (IaaS, PaaS, SaaS) e explicar como os dados fluem pelas camadas Medallion (Bronze -&gt; Silver -&gt; Gold).</w:t>
       </w:r>
     </w:p>
     <w:p>
@@ -2220,14 +2184,7 @@
           <w:b/>
           <w:bCs/>
         </w:rPr>
-        <w:t>Matriz d</w:t>
-      </w:r>
-      <w:r>
-        <w:rPr>
-          <w:b/>
-          <w:bCs/>
-        </w:rPr>
-        <w:t>os 5 Vs preenchida</w:t>
+        <w:t>Matriz dos 5 Vs preenchida</w:t>
       </w:r>
       <w:r>
         <w:t xml:space="preserve"> (Parte 3, incluindo a conexão com CD)</w:t>
@@ -2269,10 +2226,7 @@
         <w:t>Primeira versão do problema de negócio</w:t>
       </w:r>
       <w:r>
-        <w:t xml:space="preserve"> que o grupo vai ata</w:t>
-      </w:r>
-      <w:r>
-        <w:t>car no projeto (uma frase)</w:t>
+        <w:t xml:space="preserve"> que o grupo vai atacar no projeto (uma frase)</w:t>
       </w:r>
     </w:p>
     <w:bookmarkEnd w:id="15"/>
@@ -2306,10 +2260,7 @@
         <w:t>1</w:t>
       </w:r>
       <w:r>
-        <w:t xml:space="preserve"> da Aula 1: "Informação transacional vs informação </w:t>
-      </w:r>
-      <w:r>
-        <w:t>analítica"</w:t>
+        <w:t xml:space="preserve"> da Aula 1: "Informação transacional vs informação analítica"</w:t>
       </w:r>
     </w:p>
     <w:p>
@@ -2360,10 +2311,7 @@
         <w:t>Dica do Professor:</w:t>
       </w:r>
       <w:r>
-        <w:t xml:space="preserve"> Não se preocupe em "acertar" a arquitet</w:t>
-      </w:r>
-      <w:r>
-        <w:t xml:space="preserve">ura agora. O objetivo do LAB 1 é </w:t>
+        <w:t xml:space="preserve"> Não se preocupe em "acertar" a arquitetura agora. O objetivo do LAB 1 é </w:t>
       </w:r>
       <w:r>
         <w:rPr>
@@ -2942,6 +2890,13 @@
     <w:lsdException w:name="Placeholder Text" w:semiHidden="1"/>
     <w:lsdException w:name="Light Shading"/>
     <w:lsdException w:name="Light List"/>
+    <w:lsdException w:name="Light Grid"/>
+    <w:lsdException w:name="Medium Shading 1"/>
+    <w:lsdException w:name="Medium Shading 2"/>
+    <w:lsdException w:name="Medium List 1"/>
+    <w:lsdException w:name="Medium List 2"/>
+    <w:lsdException w:name="Medium Grid 1"/>
+    <w:lsdException w:name="Medium Grid 2"/>
     <w:lsdException w:name="Medium Grid 3"/>
     <w:lsdException w:name="Dark List"/>
     <w:lsdException w:name="Colorful Shading"/>

</xml_diff>